<commit_message>
added gap analysis table in gap analysis document comparing As-Is and To-Be
</commit_message>
<xml_diff>
--- a/Gap Analysis.docx
+++ b/Gap Analysis.docx
@@ -24,17 +24,55 @@
         <w:t>Gap Analysis</w:t>
       </w:r>
     </w:p>
+    <w:p>
+      <w:pPr>
+        <w:jc w:val="center"/>
+        <w:rPr>
+          <w:color w:val="2F5496" w:themeColor="accent1" w:themeShade="BF"/>
+          <w:sz w:val="36"/>
+          <w:szCs w:val="36"/>
+          <w:u w:val="double"/>
+          <w:lang w:val="en-US"/>
+        </w:rPr>
+      </w:pPr>
+    </w:p>
+    <w:p>
+      <w:pPr>
+        <w:rPr>
+          <w:b/>
+          <w:bCs/>
+          <w:lang w:val="en-US"/>
+        </w:rPr>
+      </w:pPr>
+      <w:r>
+        <w:rPr>
+          <w:b/>
+          <w:bCs/>
+          <w:lang w:val="en-US"/>
+        </w:rPr>
+        <w:t>The Gap Analysis compares the current As-Is state with the desired To-Be state. Each gap maps directly to business Requirement in the BRD</w:t>
+      </w:r>
+    </w:p>
+    <w:p>
+      <w:pPr>
+        <w:rPr>
+          <w:b/>
+          <w:bCs/>
+          <w:lang w:val="en-US"/>
+        </w:rPr>
+      </w:pPr>
+    </w:p>
     <w:tbl>
       <w:tblPr>
         <w:tblStyle w:val="GridTable4-Accent2"/>
-        <w:tblW w:w="0" w:type="auto"/>
+        <w:tblW w:w="10194" w:type="dxa"/>
         <w:tblLook w:val="04A0" w:firstRow="1" w:lastRow="0" w:firstColumn="1" w:lastColumn="0" w:noHBand="0" w:noVBand="1"/>
       </w:tblPr>
       <w:tblGrid>
         <w:gridCol w:w="704"/>
         <w:gridCol w:w="2977"/>
-        <w:gridCol w:w="3260"/>
-        <w:gridCol w:w="2384"/>
+        <w:gridCol w:w="3544"/>
+        <w:gridCol w:w="2100"/>
         <w:gridCol w:w="869"/>
       </w:tblGrid>
       <w:tr>
@@ -81,7 +119,7 @@
         </w:tc>
         <w:tc>
           <w:tcPr>
-            <w:tcW w:w="3260" w:type="dxa"/>
+            <w:tcW w:w="3544" w:type="dxa"/>
           </w:tcPr>
           <w:p>
             <w:pPr>
@@ -100,7 +138,7 @@
         </w:tc>
         <w:tc>
           <w:tcPr>
-            <w:tcW w:w="2384" w:type="dxa"/>
+            <w:tcW w:w="2100" w:type="dxa"/>
           </w:tcPr>
           <w:p>
             <w:pPr>
@@ -181,7 +219,7 @@
         </w:tc>
         <w:tc>
           <w:tcPr>
-            <w:tcW w:w="3260" w:type="dxa"/>
+            <w:tcW w:w="3544" w:type="dxa"/>
           </w:tcPr>
           <w:p>
             <w:pPr>
@@ -190,11 +228,17 @@
                 <w:lang w:val="en-US"/>
               </w:rPr>
             </w:pPr>
-          </w:p>
-        </w:tc>
-        <w:tc>
-          <w:tcPr>
-            <w:tcW w:w="2384" w:type="dxa"/>
+            <w:r>
+              <w:rPr>
+                <w:lang w:val="en-US"/>
+              </w:rPr>
+              <w:t>Customer fills structured online form with required fields</w:t>
+            </w:r>
+          </w:p>
+        </w:tc>
+        <w:tc>
+          <w:tcPr>
+            <w:tcW w:w="2100" w:type="dxa"/>
           </w:tcPr>
           <w:p>
             <w:pPr>
@@ -203,6 +247,12 @@
                 <w:lang w:val="en-US"/>
               </w:rPr>
             </w:pPr>
+            <w:r>
+              <w:rPr>
+                <w:lang w:val="en-US"/>
+              </w:rPr>
+              <w:t>No self-service return portal exists</w:t>
+            </w:r>
           </w:p>
         </w:tc>
         <w:tc>
@@ -216,6 +266,12 @@
                 <w:lang w:val="en-US"/>
               </w:rPr>
             </w:pPr>
+            <w:r>
+              <w:rPr>
+                <w:lang w:val="en-US"/>
+              </w:rPr>
+              <w:t>BR-01</w:t>
+            </w:r>
           </w:p>
         </w:tc>
       </w:tr>
@@ -266,7 +322,7 @@
         </w:tc>
         <w:tc>
           <w:tcPr>
-            <w:tcW w:w="3260" w:type="dxa"/>
+            <w:tcW w:w="3544" w:type="dxa"/>
           </w:tcPr>
           <w:p>
             <w:pPr>
@@ -275,11 +331,23 @@
                 <w:lang w:val="en-US"/>
               </w:rPr>
             </w:pPr>
-          </w:p>
-        </w:tc>
-        <w:tc>
-          <w:tcPr>
-            <w:tcW w:w="2384" w:type="dxa"/>
+            <w:r>
+              <w:rPr>
+                <w:lang w:val="en-US"/>
+              </w:rPr>
+              <w:t xml:space="preserve">System automatically validates 7-day window and </w:t>
+            </w:r>
+            <w:r>
+              <w:t>₹</w:t>
+            </w:r>
+            <w:r>
+              <w:t>299 minimum using live order data</w:t>
+            </w:r>
+          </w:p>
+        </w:tc>
+        <w:tc>
+          <w:tcPr>
+            <w:tcW w:w="2100" w:type="dxa"/>
           </w:tcPr>
           <w:p>
             <w:pPr>
@@ -288,6 +356,12 @@
                 <w:lang w:val="en-US"/>
               </w:rPr>
             </w:pPr>
+            <w:r>
+              <w:rPr>
+                <w:lang w:val="en-US"/>
+              </w:rPr>
+              <w:t>No automated eligibility engine</w:t>
+            </w:r>
           </w:p>
         </w:tc>
         <w:tc>
@@ -301,6 +375,18 @@
                 <w:lang w:val="en-US"/>
               </w:rPr>
             </w:pPr>
+            <w:r>
+              <w:rPr>
+                <w:lang w:val="en-US"/>
+              </w:rPr>
+              <w:t>BR-0</w:t>
+            </w:r>
+            <w:r>
+              <w:rPr>
+                <w:lang w:val="en-US"/>
+              </w:rPr>
+              <w:t>2</w:t>
+            </w:r>
           </w:p>
         </w:tc>
       </w:tr>
@@ -354,7 +440,7 @@
         </w:tc>
         <w:tc>
           <w:tcPr>
-            <w:tcW w:w="3260" w:type="dxa"/>
+            <w:tcW w:w="3544" w:type="dxa"/>
           </w:tcPr>
           <w:p>
             <w:pPr>
@@ -363,11 +449,17 @@
                 <w:lang w:val="en-US"/>
               </w:rPr>
             </w:pPr>
-          </w:p>
-        </w:tc>
-        <w:tc>
-          <w:tcPr>
-            <w:tcW w:w="2384" w:type="dxa"/>
+            <w:r>
+              <w:rPr>
+                <w:lang w:val="en-US"/>
+              </w:rPr>
+              <w:t xml:space="preserve">Customer receives instant email confirmation with reference number on submission </w:t>
+            </w:r>
+          </w:p>
+        </w:tc>
+        <w:tc>
+          <w:tcPr>
+            <w:tcW w:w="2100" w:type="dxa"/>
           </w:tcPr>
           <w:p>
             <w:pPr>
@@ -376,6 +468,12 @@
                 <w:lang w:val="en-US"/>
               </w:rPr>
             </w:pPr>
+            <w:r>
+              <w:rPr>
+                <w:lang w:val="en-US"/>
+              </w:rPr>
+              <w:t>No automated acknowledge system</w:t>
+            </w:r>
           </w:p>
         </w:tc>
         <w:tc>
@@ -389,6 +487,18 @@
                 <w:lang w:val="en-US"/>
               </w:rPr>
             </w:pPr>
+            <w:r>
+              <w:rPr>
+                <w:lang w:val="en-US"/>
+              </w:rPr>
+              <w:t>BR-0</w:t>
+            </w:r>
+            <w:r>
+              <w:rPr>
+                <w:lang w:val="en-US"/>
+              </w:rPr>
+              <w:t>3</w:t>
+            </w:r>
           </w:p>
         </w:tc>
       </w:tr>
@@ -439,7 +549,7 @@
         </w:tc>
         <w:tc>
           <w:tcPr>
-            <w:tcW w:w="3260" w:type="dxa"/>
+            <w:tcW w:w="3544" w:type="dxa"/>
           </w:tcPr>
           <w:p>
             <w:pPr>
@@ -448,11 +558,17 @@
                 <w:lang w:val="en-US"/>
               </w:rPr>
             </w:pPr>
-          </w:p>
-        </w:tc>
-        <w:tc>
-          <w:tcPr>
-            <w:tcW w:w="2384" w:type="dxa"/>
+            <w:r>
+              <w:rPr>
+                <w:lang w:val="en-US"/>
+              </w:rPr>
+              <w:t>System auto-generates and emails return shipping label upon approval</w:t>
+            </w:r>
+          </w:p>
+        </w:tc>
+        <w:tc>
+          <w:tcPr>
+            <w:tcW w:w="2100" w:type="dxa"/>
           </w:tcPr>
           <w:p>
             <w:pPr>
@@ -461,6 +577,12 @@
                 <w:lang w:val="en-US"/>
               </w:rPr>
             </w:pPr>
+            <w:r>
+              <w:rPr>
+                <w:lang w:val="en-US"/>
+              </w:rPr>
+              <w:t>No return label generation capability</w:t>
+            </w:r>
           </w:p>
         </w:tc>
         <w:tc>
@@ -474,6 +596,18 @@
                 <w:lang w:val="en-US"/>
               </w:rPr>
             </w:pPr>
+            <w:r>
+              <w:rPr>
+                <w:lang w:val="en-US"/>
+              </w:rPr>
+              <w:t>BR-0</w:t>
+            </w:r>
+            <w:r>
+              <w:rPr>
+                <w:lang w:val="en-US"/>
+              </w:rPr>
+              <w:t>4</w:t>
+            </w:r>
           </w:p>
         </w:tc>
       </w:tr>
@@ -527,7 +661,7 @@
         </w:tc>
         <w:tc>
           <w:tcPr>
-            <w:tcW w:w="3260" w:type="dxa"/>
+            <w:tcW w:w="3544" w:type="dxa"/>
           </w:tcPr>
           <w:p>
             <w:pPr>
@@ -536,11 +670,17 @@
                 <w:lang w:val="en-US"/>
               </w:rPr>
             </w:pPr>
-          </w:p>
-        </w:tc>
-        <w:tc>
-          <w:tcPr>
-            <w:tcW w:w="2384" w:type="dxa"/>
+            <w:r>
+              <w:rPr>
+                <w:lang w:val="en-US"/>
+              </w:rPr>
+              <w:t>Customer can view real-time return status on a tracking page</w:t>
+            </w:r>
+          </w:p>
+        </w:tc>
+        <w:tc>
+          <w:tcPr>
+            <w:tcW w:w="2100" w:type="dxa"/>
           </w:tcPr>
           <w:p>
             <w:pPr>
@@ -549,6 +689,12 @@
                 <w:lang w:val="en-US"/>
               </w:rPr>
             </w:pPr>
+            <w:r>
+              <w:rPr>
+                <w:lang w:val="en-US"/>
+              </w:rPr>
+              <w:t>No customer-facing status tracking</w:t>
+            </w:r>
           </w:p>
         </w:tc>
         <w:tc>
@@ -562,6 +708,18 @@
                 <w:lang w:val="en-US"/>
               </w:rPr>
             </w:pPr>
+            <w:r>
+              <w:rPr>
+                <w:lang w:val="en-US"/>
+              </w:rPr>
+              <w:t>BR-0</w:t>
+            </w:r>
+            <w:r>
+              <w:rPr>
+                <w:lang w:val="en-US"/>
+              </w:rPr>
+              <w:t>5</w:t>
+            </w:r>
           </w:p>
         </w:tc>
       </w:tr>
@@ -612,7 +770,7 @@
         </w:tc>
         <w:tc>
           <w:tcPr>
-            <w:tcW w:w="3260" w:type="dxa"/>
+            <w:tcW w:w="3544" w:type="dxa"/>
           </w:tcPr>
           <w:p>
             <w:pPr>
@@ -621,11 +779,17 @@
                 <w:lang w:val="en-US"/>
               </w:rPr>
             </w:pPr>
-          </w:p>
-        </w:tc>
-        <w:tc>
-          <w:tcPr>
-            <w:tcW w:w="2384" w:type="dxa"/>
+            <w:r>
+              <w:rPr>
+                <w:lang w:val="en-US"/>
+              </w:rPr>
+              <w:t>Warehouse receives structured automated notification with full item and courier details</w:t>
+            </w:r>
+          </w:p>
+        </w:tc>
+        <w:tc>
+          <w:tcPr>
+            <w:tcW w:w="2100" w:type="dxa"/>
           </w:tcPr>
           <w:p>
             <w:pPr>
@@ -634,6 +798,12 @@
                 <w:lang w:val="en-US"/>
               </w:rPr>
             </w:pPr>
+            <w:r>
+              <w:rPr>
+                <w:lang w:val="en-US"/>
+              </w:rPr>
+              <w:t>No automated warehouse notification</w:t>
+            </w:r>
           </w:p>
         </w:tc>
         <w:tc>
@@ -647,6 +817,18 @@
                 <w:lang w:val="en-US"/>
               </w:rPr>
             </w:pPr>
+            <w:r>
+              <w:rPr>
+                <w:lang w:val="en-US"/>
+              </w:rPr>
+              <w:t>BR-0</w:t>
+            </w:r>
+            <w:r>
+              <w:rPr>
+                <w:lang w:val="en-US"/>
+              </w:rPr>
+              <w:t>6</w:t>
+            </w:r>
           </w:p>
         </w:tc>
       </w:tr>
@@ -690,11 +872,17 @@
                 <w:lang w:val="en-US"/>
               </w:rPr>
             </w:pPr>
-          </w:p>
-        </w:tc>
-        <w:tc>
-          <w:tcPr>
-            <w:tcW w:w="3260" w:type="dxa"/>
+            <w:r>
+              <w:rPr>
+                <w:lang w:val="en-US"/>
+              </w:rPr>
+              <w:t>Refund triggered manually by Finance from shared Google Sheet</w:t>
+            </w:r>
+          </w:p>
+        </w:tc>
+        <w:tc>
+          <w:tcPr>
+            <w:tcW w:w="3544" w:type="dxa"/>
           </w:tcPr>
           <w:p>
             <w:pPr>
@@ -703,11 +891,17 @@
                 <w:lang w:val="en-US"/>
               </w:rPr>
             </w:pPr>
-          </w:p>
-        </w:tc>
-        <w:tc>
-          <w:tcPr>
-            <w:tcW w:w="2384" w:type="dxa"/>
+            <w:r>
+              <w:rPr>
+                <w:lang w:val="en-US"/>
+              </w:rPr>
+              <w:t>Refund auto-triggered via payment gateway API on warehouse receipt confirmation</w:t>
+            </w:r>
+          </w:p>
+        </w:tc>
+        <w:tc>
+          <w:tcPr>
+            <w:tcW w:w="2100" w:type="dxa"/>
           </w:tcPr>
           <w:p>
             <w:pPr>
@@ -716,6 +910,12 @@
                 <w:lang w:val="en-US"/>
               </w:rPr>
             </w:pPr>
+            <w:r>
+              <w:rPr>
+                <w:lang w:val="en-US"/>
+              </w:rPr>
+              <w:t>No automated return workflow</w:t>
+            </w:r>
           </w:p>
         </w:tc>
         <w:tc>
@@ -729,6 +929,18 @@
                 <w:lang w:val="en-US"/>
               </w:rPr>
             </w:pPr>
+            <w:r>
+              <w:rPr>
+                <w:lang w:val="en-US"/>
+              </w:rPr>
+              <w:t>BR-0</w:t>
+            </w:r>
+            <w:r>
+              <w:rPr>
+                <w:lang w:val="en-US"/>
+              </w:rPr>
+              <w:t>7</w:t>
+            </w:r>
           </w:p>
         </w:tc>
       </w:tr>
@@ -769,11 +981,17 @@
                 <w:lang w:val="en-US"/>
               </w:rPr>
             </w:pPr>
-          </w:p>
-        </w:tc>
-        <w:tc>
-          <w:tcPr>
-            <w:tcW w:w="3260" w:type="dxa"/>
+            <w:r>
+              <w:rPr>
+                <w:lang w:val="en-US"/>
+              </w:rPr>
+              <w:t>Return reasons captured in unstructured email text – only 31% usable</w:t>
+            </w:r>
+          </w:p>
+        </w:tc>
+        <w:tc>
+          <w:tcPr>
+            <w:tcW w:w="3544" w:type="dxa"/>
           </w:tcPr>
           <w:p>
             <w:pPr>
@@ -782,11 +1000,17 @@
                 <w:lang w:val="en-US"/>
               </w:rPr>
             </w:pPr>
-          </w:p>
-        </w:tc>
-        <w:tc>
-          <w:tcPr>
-            <w:tcW w:w="2384" w:type="dxa"/>
+            <w:r>
+              <w:rPr>
+                <w:lang w:val="en-US"/>
+              </w:rPr>
+              <w:t>Customer selects from structured reason dropdown – 100% capture rate</w:t>
+            </w:r>
+          </w:p>
+        </w:tc>
+        <w:tc>
+          <w:tcPr>
+            <w:tcW w:w="2100" w:type="dxa"/>
           </w:tcPr>
           <w:p>
             <w:pPr>
@@ -795,6 +1019,12 @@
                 <w:lang w:val="en-US"/>
               </w:rPr>
             </w:pPr>
+            <w:r>
+              <w:rPr>
+                <w:lang w:val="en-US"/>
+              </w:rPr>
+              <w:t>No structured return reason captured</w:t>
+            </w:r>
           </w:p>
         </w:tc>
         <w:tc>
@@ -808,6 +1038,18 @@
                 <w:lang w:val="en-US"/>
               </w:rPr>
             </w:pPr>
+            <w:r>
+              <w:rPr>
+                <w:lang w:val="en-US"/>
+              </w:rPr>
+              <w:t>BR-0</w:t>
+            </w:r>
+            <w:r>
+              <w:rPr>
+                <w:lang w:val="en-US"/>
+              </w:rPr>
+              <w:t>8</w:t>
+            </w:r>
           </w:p>
         </w:tc>
       </w:tr>
@@ -851,11 +1093,17 @@
                 <w:lang w:val="en-US"/>
               </w:rPr>
             </w:pPr>
-          </w:p>
-        </w:tc>
-        <w:tc>
-          <w:tcPr>
-            <w:tcW w:w="3260" w:type="dxa"/>
+            <w:r>
+              <w:rPr>
+                <w:lang w:val="en-US"/>
+              </w:rPr>
+              <w:t>Multiple agents can approve the same return – no deduplication</w:t>
+            </w:r>
+          </w:p>
+        </w:tc>
+        <w:tc>
+          <w:tcPr>
+            <w:tcW w:w="3544" w:type="dxa"/>
           </w:tcPr>
           <w:p>
             <w:pPr>
@@ -864,11 +1112,17 @@
                 <w:lang w:val="en-US"/>
               </w:rPr>
             </w:pPr>
-          </w:p>
-        </w:tc>
-        <w:tc>
-          <w:tcPr>
-            <w:tcW w:w="2384" w:type="dxa"/>
+            <w:r>
+              <w:rPr>
+                <w:lang w:val="en-US"/>
+              </w:rPr>
+              <w:t>System detects and blocks duplicate return requests</w:t>
+            </w:r>
+          </w:p>
+        </w:tc>
+        <w:tc>
+          <w:tcPr>
+            <w:tcW w:w="2100" w:type="dxa"/>
           </w:tcPr>
           <w:p>
             <w:pPr>
@@ -877,6 +1131,12 @@
                 <w:lang w:val="en-US"/>
               </w:rPr>
             </w:pPr>
+            <w:r>
+              <w:rPr>
+                <w:lang w:val="en-US"/>
+              </w:rPr>
+              <w:t>No duplicate prevention logic</w:t>
+            </w:r>
           </w:p>
         </w:tc>
         <w:tc>
@@ -890,6 +1150,18 @@
                 <w:lang w:val="en-US"/>
               </w:rPr>
             </w:pPr>
+            <w:r>
+              <w:rPr>
+                <w:lang w:val="en-US"/>
+              </w:rPr>
+              <w:t>BR-0</w:t>
+            </w:r>
+            <w:r>
+              <w:rPr>
+                <w:lang w:val="en-US"/>
+              </w:rPr>
+              <w:t>9</w:t>
+            </w:r>
           </w:p>
         </w:tc>
       </w:tr>
@@ -930,11 +1202,17 @@
                 <w:lang w:val="en-US"/>
               </w:rPr>
             </w:pPr>
-          </w:p>
-        </w:tc>
-        <w:tc>
-          <w:tcPr>
-            <w:tcW w:w="3260" w:type="dxa"/>
+            <w:r>
+              <w:rPr>
+                <w:lang w:val="en-US"/>
+              </w:rPr>
+              <w:t>No data captured for management reporting on return trends</w:t>
+            </w:r>
+          </w:p>
+        </w:tc>
+        <w:tc>
+          <w:tcPr>
+            <w:tcW w:w="3544" w:type="dxa"/>
           </w:tcPr>
           <w:p>
             <w:pPr>
@@ -943,11 +1221,17 @@
                 <w:lang w:val="en-US"/>
               </w:rPr>
             </w:pPr>
-          </w:p>
-        </w:tc>
-        <w:tc>
-          <w:tcPr>
-            <w:tcW w:w="2384" w:type="dxa"/>
+            <w:r>
+              <w:rPr>
+                <w:lang w:val="en-US"/>
+              </w:rPr>
+              <w:t>Management dashboard shows return volumes, reasons, resolution times</w:t>
+            </w:r>
+          </w:p>
+        </w:tc>
+        <w:tc>
+          <w:tcPr>
+            <w:tcW w:w="2100" w:type="dxa"/>
           </w:tcPr>
           <w:p>
             <w:pPr>
@@ -956,6 +1240,12 @@
                 <w:lang w:val="en-US"/>
               </w:rPr>
             </w:pPr>
+            <w:r>
+              <w:rPr>
+                <w:lang w:val="en-US"/>
+              </w:rPr>
+              <w:t>No analytics or reporting capability</w:t>
+            </w:r>
           </w:p>
         </w:tc>
         <w:tc>
@@ -969,6 +1259,18 @@
                 <w:lang w:val="en-US"/>
               </w:rPr>
             </w:pPr>
+            <w:r>
+              <w:rPr>
+                <w:lang w:val="en-US"/>
+              </w:rPr>
+              <w:t>BR-</w:t>
+            </w:r>
+            <w:r>
+              <w:rPr>
+                <w:lang w:val="en-US"/>
+              </w:rPr>
+              <w:t>10</w:t>
+            </w:r>
           </w:p>
         </w:tc>
       </w:tr>
@@ -1006,11 +1308,17 @@
                 <w:lang w:val="en-US"/>
               </w:rPr>
             </w:pPr>
-          </w:p>
-        </w:tc>
-        <w:tc>
-          <w:tcPr>
-            <w:tcW w:w="3260" w:type="dxa"/>
+            <w:r>
+              <w:rPr>
+                <w:lang w:val="en-US"/>
+              </w:rPr>
+              <w:t>No audit trail – records spread across Gmail, WhatsApp, Google Sheets</w:t>
+            </w:r>
+          </w:p>
+        </w:tc>
+        <w:tc>
+          <w:tcPr>
+            <w:tcW w:w="3544" w:type="dxa"/>
           </w:tcPr>
           <w:p>
             <w:pPr>
@@ -1019,11 +1327,17 @@
                 <w:lang w:val="en-US"/>
               </w:rPr>
             </w:pPr>
-          </w:p>
-        </w:tc>
-        <w:tc>
-          <w:tcPr>
-            <w:tcW w:w="2384" w:type="dxa"/>
+            <w:r>
+              <w:rPr>
+                <w:lang w:val="en-US"/>
+              </w:rPr>
+              <w:t>Full timestamped transaction log for every return event</w:t>
+            </w:r>
+          </w:p>
+        </w:tc>
+        <w:tc>
+          <w:tcPr>
+            <w:tcW w:w="2100" w:type="dxa"/>
           </w:tcPr>
           <w:p>
             <w:pPr>
@@ -1032,6 +1346,12 @@
                 <w:lang w:val="en-US"/>
               </w:rPr>
             </w:pPr>
+            <w:r>
+              <w:rPr>
+                <w:lang w:val="en-US"/>
+              </w:rPr>
+              <w:t>No centralized audit trail</w:t>
+            </w:r>
           </w:p>
         </w:tc>
         <w:tc>
@@ -1045,6 +1365,18 @@
                 <w:lang w:val="en-US"/>
               </w:rPr>
             </w:pPr>
+            <w:r>
+              <w:rPr>
+                <w:lang w:val="en-US"/>
+              </w:rPr>
+              <w:t>BR-</w:t>
+            </w:r>
+            <w:r>
+              <w:rPr>
+                <w:lang w:val="en-US"/>
+              </w:rPr>
+              <w:t>12</w:t>
+            </w:r>
           </w:p>
         </w:tc>
       </w:tr>
@@ -1670,7 +2002,6 @@
   <w:style w:type="character" w:default="1" w:styleId="DefaultParagraphFont">
     <w:name w:val="Default Paragraph Font"/>
     <w:uiPriority w:val="1"/>
-    <w:semiHidden/>
     <w:unhideWhenUsed/>
   </w:style>
   <w:style w:type="table" w:default="1" w:styleId="TableNormal">

</xml_diff>